<commit_message>
new evaluate and detect classess with reports
</commit_message>
<xml_diff>
--- a/Final_Report.docx
+++ b/Final_Report.docx
@@ -123,21 +123,6 @@
       </w:sdtContent>
     </w:sdt>
     <w:p>
-      <w:pPr>
-        <w:spacing w:after="40"/>
-      </w:pPr>
-      <w:r>
-        <w:rPr>
-          <w:i/>
-          <w:iCs/>
-          <w:color w:val="888888"/>
-          <w:sz w:val="18"/>
-          <w:szCs w:val="18"/>
-        </w:rPr>
-        <w:t xml:space="preserve">(In Word, right-click the table above and choose “Update Field” to populate page numbers.)</w:t>
-      </w:r>
-    </w:p>
-    <w:p>
       <w:r>
         <w:br w:type="page"/>
       </w:r>
@@ -155,7 +140,7 @@
         <w:spacing w:after="160"/>
       </w:pPr>
       <w:r>
-        <w:t xml:space="preserve">This project builds a system that automatically divides an egocentric (first-person) video of a hardware-assembly procedure into its constituent steps. The task is temporal segmentation — locating the boundaries between procedural steps in time — and explicitly excludes action recognition. A modular, feature-based pipeline fuses hand tracking, open-vocabulary object detection with workspace regions of interest, dense optical flow, scene-change detection, and hand-object interaction cues into a per-frame transition score, from which step boundaries are extracted as prominent peaks. The system is evaluated on four PC-assembly clips against manually annotated ground truth using boundary precision, recall, and F1 at several tolerances. On clean, continuously recorded procedures it achieves an F1 of 0.62–0.71 at a one-second tolerance and recovers every boundary within three seconds, with matched-boundary error of 0.1–0.4 s, and it outperforms uniform and random baselines at the tight tolerances that matter. An ablation study shows optical flow to be the dominant cue. The work also yields two methodological findings: evaluation quality is dominated by the fidelity of the ground-truth annotation, and edited tutorial footage (with presenter cut-aways and graphics) is poorly suited to feature-based segmentation.</w:t>
+        <w:t xml:space="preserve">This project builds a system that automatically divides an egocentric (first-person) video of a hardware-assembly procedure into its constituent steps. The task is temporal segmentation — locating the boundaries between procedural steps in time — and explicitly excludes action recognition. A modular, feature-based pipeline fuses hand tracking, open-vocabulary object detection with workspace regions of interest, dense optical flow, scene-change detection, and hand-object interaction cues into a per-frame transition score, from which step boundaries are extracted as prominent peaks. The system is evaluated on four PC-assembly clips against manually annotated ground truth using boundary precision, recall, and F1 at several tolerances. On clean, continuously recorded procedures it achieves an F1 of 0.62–0.71 at a one-second tolerance and recovers every boundary within three seconds, with matched-boundary error of 0.1–0.4 s, and it outperforms uniform and random baselines at the tight tolerances that matter. A single, fixed configuration (no per-clip tuning) reaches F1 0.73 and 0.71 on the two clean clips, and leave-one-clip-out cross-validation confirms this generalises to unseen clips (clean held-out mean F1 0.66); full details are in the accompanying Extended Evaluation Supplement. An ablation study shows optical flow to be the dominant cue. The work also yields two methodological findings: evaluation quality is dominated by the fidelity of the ground-truth annotation, and edited tutorial footage (with presenter cut-aways and graphics) is poorly suited to feature-based segmentation.</w:t>
       </w:r>
     </w:p>
     <w:p>
@@ -1215,7 +1200,7 @@
         <w:spacing w:after="160"/>
       </w:pPr>
       <w:r>
-        <w:t xml:space="preserve">Predicted boundaries are compared to ground-truth boundaries using precision, recall, and F1 at temporal tolerances of 0.5, 1.0, 1.5, 2.0, and 3.0 seconds; a prediction is correct if it lies within the tolerance of a true boundary. The mean absolute error of matched boundaries, average segment intersection-over-union, and temporal coverage are also reported. Multiple tolerances are used because, for procedural video, a boundary within roughly one to two seconds of the true transition is operationally useful.</w:t>
+        <w:t xml:space="preserve">Predicted boundaries are compared to ground-truth boundaries using precision, recall, and F1 at temporal tolerances of 0.5, 1.0, 1.5, 2.0, and 3.0 seconds; a prediction is correct if it lies within the tolerance of a true boundary. The mean absolute error of matched boundaries, average segment intersection-over-union, and temporal coverage are also reported. Multiple tolerances are used because, for procedural video, a boundary within roughly one to two seconds of the true transition is operationally useful. Matching of predicted to ground-truth boundaries is computed optimally as a one-to-one assignment (the Hungarian algorithm), so the reported F1 and the matched-boundary error are mutually consistent and independent of the order in which boundaries are considered.</w:t>
       </w:r>
     </w:p>
     <w:p>
@@ -2436,7 +2421,7 @@
         <w:spacing w:after="160"/>
       </w:pPr>
       <w:r>
-        <w:t xml:space="preserve">On the two clean procedures the system recovers every ground-truth boundary within a three-second tolerance and localises matched boundaries to within 0.1–0.4 s on average. On the two edited tutorials performance drops sharply, for the reasons analysed in Section 7.</w:t>
+        <w:t xml:space="preserve">On the two clean procedures the system recovers every ground-truth boundary within a three-second tolerance and localises matched boundaries to within 0.1–0.4 s on average. On the two edited tutorials performance drops sharply, for the reasons analysed in Section 7. To remove any dependence on per-clip tuning, a single global configuration (boundary threshold 0.70, minimum duration 2.0 s) was also evaluated on every clip: it reaches F1 0.727 (cooling fan) and 0.714 (CPU) at a 1.0 s tolerance — equal to or better than the per-clip-tuned values above — and leave-one-clip-out cross-validation (tuning on three clips, testing on the fourth) gives a clean-clip held-out mean F1 of 0.658. These stricter protocols, together with threshold-sensitivity, annotation-robustness, change-point-baseline, and cue-ablation analyses, are reported in full in the accompanying Extended Evaluation Supplement and are reproducible via evaluate_extended.py.</w:t>
       </w:r>
     </w:p>
     <w:p>
@@ -4364,7 +4349,7 @@
         <w:spacing w:after="160"/>
       </w:pPr>
       <w:r>
-        <w:t xml:space="preserve">The system meets the project objective on clean egocentric procedures: it locates step boundaries accurately and precisely using only motion, hand, flow, and scene features, with no dependence on action recognition. It outperforms naive baselines at the tolerances that matter, and an ablation confirms optical flow as the principal cue. Beyond the working system, the project contributes two reusable lessons about annotation fidelity and footage suitability. Future work includes training a lightweight custom detector for reliable component labels, GPU acceleration to enable larger experiments, broadening the evaluation to more continuous clips, and adding learned boundary cues for low-motion transitions.</w:t>
+        <w:t xml:space="preserve">The system meets the project objective on clean egocentric procedures: it locates step boundaries accurately and precisely using only motion, hand, flow, and scene features, with no dependence on action recognition. It outperforms naive baselines at the tolerances that matter, and an ablation confirms optical flow as the principal cue. Beyond the working system, the project contributes two reusable lessons about annotation fidelity and footage suitability. Future work includes training a lightweight custom detector for reliable component labels, GPU acceleration to enable larger experiments, broadening the evaluation to more continuous clips, and adding learned boundary cues for low-motion transitions. An extended evaluation — held-out cross-validation, threshold sensitivity, annotation robustness, a change-point baseline, and a cue ablation — is provided in the accompanying Extended Evaluation Supplement (Extended_Evaluation.docx) and is fully reproducible via evaluate_extended.py.</w:t>
       </w:r>
     </w:p>
     <w:p>
@@ -4526,21 +4511,6 @@
           <w:szCs w:val="20"/>
         </w:rPr>
         <w:t xml:space="preserve">D. Shan, J. Geng, M. Shu, and D. F. Fouhey, “Understanding Human Hands in Contact at Internet Scale,” IEEE/CVF CVPR, 2020.</w:t>
-      </w:r>
-    </w:p>
-    <w:p>
-      <w:pPr>
-        <w:spacing w:before="60"/>
-      </w:pPr>
-      <w:r>
-        <w:rPr>
-          <w:i/>
-          <w:iCs/>
-          <w:color w:val="888888"/>
-          <w:sz w:val="18"/>
-          <w:szCs w:val="18"/>
-        </w:rPr>
-        <w:t xml:space="preserve">Note: format these references to your course’s required citation style (e.g., IEEE or APA) before submission.</w:t>
       </w:r>
     </w:p>
     <w:p>

</xml_diff>